<commit_message>
sql/search toggle, docx in editor
</commit_message>
<xml_diff>
--- a/documents/lawyering_skills_and_strategies/Research Report-1.docx
+++ b/documents/lawyering_skills_and_strategies/Research Report-1.docx
@@ -135,27 +135,7 @@
           <w:sz w:val="24"/>
           <w:szCs w:val="24"/>
         </w:rPr>
-        <w:t xml:space="preserve">Roberts v. Fed. Express Corp., 842 S.W.2d 246, 247-48 (Tenn. 1992): In this case, FedEx had a long time employee arrested for theft after he set off a security scanner while carrying items from damaged packages. It shows the binding list of elements </w:t>
-      </w:r>
-      <w:r>
-        <w:rPr>
-          <w:rFonts w:ascii="Times New Roman" w:hAnsi="Times New Roman"/>
-          <w:b w:val="false"/>
-          <w:bCs w:val="false"/>
-          <w:sz w:val="24"/>
-          <w:szCs w:val="24"/>
-        </w:rPr>
-        <w:t>(1) a prior suit or judicial proceeding was instituted without probable cause, (2) defendant brought such prior action with malice, and (3) the prior action was finally terminated in plaintiff’s favor</w:t>
-      </w:r>
-      <w:r>
-        <w:rPr>
-          <w:rFonts w:ascii="Times New Roman" w:hAnsi="Times New Roman"/>
-          <w:b w:val="false"/>
-          <w:bCs w:val="false"/>
-          <w:sz w:val="24"/>
-          <w:szCs w:val="24"/>
-        </w:rPr>
-        <w:t>. Probable cause is judged by what a reasonable person would have believed. Malice is about the defendant's actual motive. Both are usually for a jury to decide</w:t>
+        <w:t>Roberts v. Fed. Express Corp., 842 S.W.2d 246, 247-48 (Tenn. 1992): In this case, FedEx had a long time employee arrested for theft after he set off a security scanner while carrying items from damaged packages. It shows the binding list of elements (1) a prior suit or judicial proceeding was instituted without probable cause, (2) defendant brought such prior action with malice, and (3) the prior action was finally terminated in plaintiff’s favor. Probable cause is judged by what a reasonable person would have believed. Malice is about the defendant's actual motive. Both are usually for a jury to decide</w:t>
       </w:r>
     </w:p>
     <w:p>
@@ -375,7 +355,7 @@
               </w:numPr>
               <w:suppressAutoHyphens w:val="true"/>
               <w:spacing w:before="0" w:after="200"/>
-              <w:ind w:hanging="0"/>
+              <w:ind w:left="0" w:hanging="0"/>
               <w:jc w:val="left"/>
               <w:rPr>
                 <w:rFonts w:ascii="Times New Roman" w:hAnsi="Times New Roman"/>
@@ -502,6 +482,8 @@
               <w:rPr>
                 <w:rFonts w:ascii="anthropic-sans;system-ui;Segoe UI;Roboto;Helvetica;Arial;PingFang SC;PingFang TC;Hiragino Sans;Apple SD Gothic Neo;Kohinoor Devanagari;Kohinoor Bangla;Kohinoor Telugu;Tamil Sangam MN;Kohinoor Gujarati;Malayalam Sangam MN;Nirmala UI;Noto Sans Devanagari UI;Noto Sans Devanagari;Noto Sans Bengali UI;Noto Sans Bengali;Noto Sans Telugu UI;Noto Sans Telugu;Noto Sans Tamil UI;Noto Sans Tamil;Noto Sans Gujarati UI;Noto Sans Gujarati;Noto Sans Kannada UI;Noto Sans Kannada;Noto Sans Malayalam UI;Noto Sans Malayalam;Thonburi;Leelawadee UI;Noto Sans Thai UI;Noto Sans Thai;Kefa;Ebrima;Noto Sans Ethiopic;Abyssinica SIL;sans-serif;ui-sans-serif;system-ui;apple-system;Segoe UI;Roboto;PingFang SC;PingFang TC;Hiragino Sans;Apple SD Gothic Neo;sans-serif" w:hAnsi="anthropic-sans;system-ui;Segoe UI;Roboto;Helvetica;Arial;PingFang SC;PingFang TC;Hiragino Sans;Apple SD Gothic Neo;Kohinoor Devanagari;Kohinoor Bangla;Kohinoor Telugu;Tamil Sangam MN;Kohinoor Gujarati;Malayalam Sangam MN;Nirmala UI;Noto Sans Devanagari UI;Noto Sans Devanagari;Noto Sans Bengali UI;Noto Sans Bengali;Noto Sans Telugu UI;Noto Sans Telugu;Noto Sans Tamil UI;Noto Sans Tamil;Noto Sans Gujarati UI;Noto Sans Gujarati;Noto Sans Kannada UI;Noto Sans Kannada;Noto Sans Malayalam UI;Noto Sans Malayalam;Thonburi;Leelawadee UI;Noto Sans Thai UI;Noto Sans Thai;Kefa;Ebrima;Noto Sans Ethiopic;Abyssinica SIL;sans-serif;ui-sans-serif;system-ui;apple-system;Segoe UI;Roboto;PingFang SC;PingFang TC;Hiragino Sans;Apple SD Gothic Neo;sans-serif"/>
                 <w:b w:val="false"/>
+                <w:b w:val="false"/>
+                <w:i w:val="false"/>
                 <w:i w:val="false"/>
                 <w:caps w:val="false"/>
                 <w:smallCaps w:val="false"/>
@@ -523,97 +505,7 @@
                 <w:szCs w:val="22"/>
                 <w:lang w:val="en-US" w:eastAsia="en-US" w:bidi="ar-SA"/>
               </w:rPr>
-              <w:t xml:space="preserve">FedEx had a long-time employee arrested for larceny after he set off a </w:t>
-            </w:r>
-            <w:r>
-              <w:rPr>
-                <w:rFonts w:eastAsia="Calibri" w:cs="Times New Roman" w:ascii="Times New Roman" w:hAnsi="Times New Roman"/>
-                <w:b w:val="false"/>
-                <w:i w:val="false"/>
-                <w:caps w:val="false"/>
-                <w:smallCaps w:val="false"/>
-                <w:spacing w:val="0"/>
-                <w:kern w:val="0"/>
-                <w:sz w:val="22"/>
-                <w:szCs w:val="22"/>
-                <w:lang w:val="en-US" w:eastAsia="en-US" w:bidi="ar-SA"/>
-              </w:rPr>
-              <w:t>screening device while</w:t>
-            </w:r>
-            <w:r>
-              <w:rPr>
-                <w:rFonts w:eastAsia="Calibri" w:cs="Times New Roman" w:ascii="Times New Roman" w:hAnsi="Times New Roman"/>
-                <w:b w:val="false"/>
-                <w:i w:val="false"/>
-                <w:caps w:val="false"/>
-                <w:smallCaps w:val="false"/>
-                <w:spacing w:val="0"/>
-                <w:kern w:val="0"/>
-                <w:sz w:val="22"/>
-                <w:szCs w:val="22"/>
-                <w:lang w:val="en-US" w:eastAsia="en-US" w:bidi="ar-SA"/>
-              </w:rPr>
-              <w:t xml:space="preserve"> carrying items from damaged packages </w:t>
-            </w:r>
-            <w:r>
-              <w:rPr>
-                <w:rFonts w:eastAsia="Calibri" w:cs="Times New Roman" w:ascii="Times New Roman" w:hAnsi="Times New Roman"/>
-                <w:b w:val="false"/>
-                <w:i w:val="false"/>
-                <w:caps w:val="false"/>
-                <w:smallCaps w:val="false"/>
-                <w:spacing w:val="0"/>
-                <w:kern w:val="0"/>
-                <w:sz w:val="22"/>
-                <w:szCs w:val="22"/>
-                <w:lang w:val="en-US" w:eastAsia="en-US" w:bidi="ar-SA"/>
-              </w:rPr>
-              <w:t>that he forgot he put in his jacket</w:t>
-            </w:r>
-            <w:r>
-              <w:rPr>
-                <w:rFonts w:eastAsia="Calibri" w:cs="Times New Roman" w:ascii="Times New Roman" w:hAnsi="Times New Roman"/>
-                <w:b w:val="false"/>
-                <w:i w:val="false"/>
-                <w:caps w:val="false"/>
-                <w:smallCaps w:val="false"/>
-                <w:spacing w:val="0"/>
-                <w:kern w:val="0"/>
-                <w:sz w:val="22"/>
-                <w:szCs w:val="22"/>
-                <w:lang w:val="en-US" w:eastAsia="en-US" w:bidi="ar-SA"/>
-              </w:rPr>
-              <w:t xml:space="preserve">. He said he routinely </w:t>
-            </w:r>
-            <w:r>
-              <w:rPr>
-                <w:rFonts w:eastAsia="Calibri" w:cs="Times New Roman" w:ascii="Times New Roman" w:hAnsi="Times New Roman"/>
-                <w:b w:val="false"/>
-                <w:i w:val="false"/>
-                <w:caps w:val="false"/>
-                <w:smallCaps w:val="false"/>
-                <w:spacing w:val="0"/>
-                <w:kern w:val="0"/>
-                <w:sz w:val="22"/>
-                <w:szCs w:val="22"/>
-                <w:lang w:val="en-US" w:eastAsia="en-US" w:bidi="ar-SA"/>
-              </w:rPr>
-              <w:t>picked up and turned in items that fell out of packages although not always on the same day</w:t>
-            </w:r>
-            <w:r>
-              <w:rPr>
-                <w:rFonts w:eastAsia="Calibri" w:cs="Times New Roman" w:ascii="Times New Roman" w:hAnsi="Times New Roman"/>
-                <w:b w:val="false"/>
-                <w:i w:val="false"/>
-                <w:caps w:val="false"/>
-                <w:smallCaps w:val="false"/>
-                <w:spacing w:val="0"/>
-                <w:kern w:val="0"/>
-                <w:sz w:val="22"/>
-                <w:szCs w:val="22"/>
-                <w:lang w:val="en-US" w:eastAsia="en-US" w:bidi="ar-SA"/>
-              </w:rPr>
-              <w:t>. The Supreme Court held probable cause is judged objectively, is a jury question, and the jury decides what a reasonable investigation would have revealed.</w:t>
+              <w:t>FedEx had a long-time employee arrested for larceny after he set off a screening device while carrying items from damaged packages that he forgot he put in his jacket. He said he routinely picked up and turned in items that fell out of packages although not always on the same day. The Supreme Court held probable cause is judged objectively, is a jury question, and the jury decides what a reasonable investigation would have revealed.</w:t>
             </w:r>
           </w:p>
         </w:tc>
@@ -732,189 +624,7 @@
                 <w:szCs w:val="22"/>
                 <w:lang w:val="en-US" w:eastAsia="en-US" w:bidi="ar-SA"/>
               </w:rPr>
-              <w:t xml:space="preserve">A rental-store manager reported a customer to police for theft after he stopped paying on a rented air compressor. </w:t>
-            </w:r>
-            <w:r>
-              <w:rPr>
-                <w:rFonts w:eastAsia="Calibri" w:cs="Times New Roman" w:ascii="Times New Roman" w:hAnsi="Times New Roman"/>
-                <w:b w:val="false"/>
-                <w:bCs w:val="false"/>
-                <w:i w:val="false"/>
-                <w:kern w:val="0"/>
-                <w:sz w:val="22"/>
-                <w:szCs w:val="22"/>
-                <w:lang w:val="en-US" w:eastAsia="en-US" w:bidi="ar-SA"/>
-              </w:rPr>
-              <w:t>A</w:t>
-            </w:r>
-            <w:r>
-              <w:rPr>
-                <w:rFonts w:eastAsia="Calibri" w:cs="Times New Roman" w:ascii="Times New Roman" w:hAnsi="Times New Roman"/>
-                <w:b w:val="false"/>
-                <w:bCs w:val="false"/>
-                <w:i w:val="false"/>
-                <w:kern w:val="0"/>
-                <w:sz w:val="22"/>
-                <w:szCs w:val="22"/>
-                <w:lang w:val="en-US" w:eastAsia="en-US" w:bidi="ar-SA"/>
-              </w:rPr>
-              <w:t xml:space="preserve"> magistrate found probable cause and issued a warrant </w:t>
-            </w:r>
-            <w:r>
-              <w:rPr>
-                <w:rFonts w:eastAsia="Calibri" w:cs="Times New Roman" w:ascii="Times New Roman" w:hAnsi="Times New Roman"/>
-                <w:b w:val="false"/>
-                <w:bCs w:val="false"/>
-                <w:i w:val="false"/>
-                <w:kern w:val="0"/>
-                <w:sz w:val="22"/>
-                <w:szCs w:val="22"/>
-                <w:lang w:val="en-US" w:eastAsia="en-US" w:bidi="ar-SA"/>
-              </w:rPr>
-              <w:t>for his arrest</w:t>
-            </w:r>
-            <w:r>
-              <w:rPr>
-                <w:rFonts w:eastAsia="Calibri" w:cs="Times New Roman" w:ascii="Times New Roman" w:hAnsi="Times New Roman"/>
-                <w:b w:val="false"/>
-                <w:bCs w:val="false"/>
-                <w:i w:val="false"/>
-                <w:kern w:val="0"/>
-                <w:sz w:val="22"/>
-                <w:szCs w:val="22"/>
-                <w:lang w:val="en-US" w:eastAsia="en-US" w:bidi="ar-SA"/>
-              </w:rPr>
-              <w:t xml:space="preserve">. </w:t>
-            </w:r>
-            <w:r>
-              <w:rPr>
-                <w:rFonts w:eastAsia="Calibri" w:cs="Times New Roman" w:ascii="Times New Roman" w:hAnsi="Times New Roman"/>
-                <w:b w:val="false"/>
-                <w:bCs w:val="false"/>
-                <w:i w:val="false"/>
-                <w:kern w:val="0"/>
-                <w:sz w:val="22"/>
-                <w:szCs w:val="22"/>
-                <w:lang w:val="en-US" w:eastAsia="en-US" w:bidi="ar-SA"/>
-              </w:rPr>
-              <w:t xml:space="preserve">In Feb 2016, </w:t>
-            </w:r>
-            <w:r>
-              <w:rPr>
-                <w:rFonts w:eastAsia="Calibri" w:cs="Times New Roman" w:ascii="Times New Roman" w:hAnsi="Times New Roman"/>
-                <w:b w:val="false"/>
-                <w:bCs w:val="false"/>
-                <w:i w:val="false"/>
-                <w:kern w:val="0"/>
-                <w:sz w:val="22"/>
-                <w:szCs w:val="22"/>
-                <w:lang w:val="en-US" w:eastAsia="en-US" w:bidi="ar-SA"/>
-              </w:rPr>
-              <w:t>t</w:t>
-            </w:r>
-            <w:r>
-              <w:rPr>
-                <w:rFonts w:eastAsia="Calibri" w:cs="Times New Roman" w:ascii="Times New Roman" w:hAnsi="Times New Roman"/>
-                <w:b w:val="false"/>
-                <w:bCs w:val="false"/>
-                <w:i w:val="false"/>
-                <w:kern w:val="0"/>
-                <w:sz w:val="22"/>
-                <w:szCs w:val="22"/>
-                <w:lang w:val="en-US" w:eastAsia="en-US" w:bidi="ar-SA"/>
-              </w:rPr>
-              <w:t xml:space="preserve">he parties </w:t>
-            </w:r>
-            <w:r>
-              <w:rPr>
-                <w:rFonts w:eastAsia="Calibri" w:cs="Times New Roman" w:ascii="Times New Roman" w:hAnsi="Times New Roman"/>
-                <w:b w:val="false"/>
-                <w:bCs w:val="false"/>
-                <w:i w:val="false"/>
-                <w:kern w:val="0"/>
-                <w:sz w:val="22"/>
-                <w:szCs w:val="22"/>
-                <w:lang w:val="en-US" w:eastAsia="en-US" w:bidi="ar-SA"/>
-              </w:rPr>
-              <w:t>executed a settlement agreement which released all claims concerning the air compressor.</w:t>
-            </w:r>
-            <w:r>
-              <w:rPr>
-                <w:rFonts w:eastAsia="Calibri" w:cs="Times New Roman" w:ascii="Times New Roman" w:hAnsi="Times New Roman"/>
-                <w:b w:val="false"/>
-                <w:bCs w:val="false"/>
-                <w:i w:val="false"/>
-                <w:kern w:val="0"/>
-                <w:sz w:val="22"/>
-                <w:szCs w:val="22"/>
-                <w:lang w:val="en-US" w:eastAsia="en-US" w:bidi="ar-SA"/>
-              </w:rPr>
-              <w:t xml:space="preserve"> </w:t>
-            </w:r>
-            <w:r>
-              <w:rPr>
-                <w:rFonts w:eastAsia="Calibri" w:cs="Times New Roman" w:ascii="Times New Roman" w:hAnsi="Times New Roman"/>
-                <w:b w:val="false"/>
-                <w:bCs w:val="false"/>
-                <w:i w:val="false"/>
-                <w:kern w:val="0"/>
-                <w:sz w:val="22"/>
-                <w:szCs w:val="22"/>
-                <w:lang w:val="en-US" w:eastAsia="en-US" w:bidi="ar-SA"/>
-              </w:rPr>
-              <w:t xml:space="preserve">However, in Feb 2018, a police officer arrested Plaintiff on the outstanding warrant from United Rentals. Plaintiff told the officer to call his attorney so the attorney could explain that his dispute with United Rentals had been settled, the officer did not. </w:t>
-            </w:r>
-            <w:r>
-              <w:rPr>
-                <w:rFonts w:eastAsia="Calibri" w:cs="Times New Roman" w:ascii="Times New Roman" w:hAnsi="Times New Roman"/>
-                <w:b w:val="false"/>
-                <w:bCs w:val="false"/>
-                <w:i w:val="false"/>
-                <w:kern w:val="0"/>
-                <w:sz w:val="22"/>
-                <w:szCs w:val="22"/>
-                <w:lang w:val="en-US" w:eastAsia="en-US" w:bidi="ar-SA"/>
-              </w:rPr>
-              <w:t xml:space="preserve">Howell sued United Rentals and Miller, the manager for false arrest, false imprisonment and other claims. </w:t>
-            </w:r>
-            <w:r>
-              <w:rPr>
-                <w:rFonts w:eastAsia="Calibri" w:cs="Times New Roman" w:ascii="Times New Roman" w:hAnsi="Times New Roman"/>
-                <w:b w:val="false"/>
-                <w:bCs w:val="false"/>
-                <w:i w:val="false"/>
-                <w:kern w:val="0"/>
-                <w:sz w:val="22"/>
-                <w:szCs w:val="22"/>
-                <w:lang w:val="en-US" w:eastAsia="en-US" w:bidi="ar-SA"/>
-              </w:rPr>
-              <w:t xml:space="preserve">The court of appeals affirmed summary judgment for the store. </w:t>
-            </w:r>
-            <w:r>
-              <w:rPr>
-                <w:rFonts w:eastAsia="Calibri" w:cs="Times New Roman" w:ascii="Times New Roman" w:hAnsi="Times New Roman"/>
-                <w:b w:val="false"/>
-                <w:bCs w:val="false"/>
-                <w:i w:val="false"/>
-                <w:kern w:val="0"/>
-                <w:sz w:val="22"/>
-                <w:szCs w:val="22"/>
-                <w:lang w:val="en-US" w:eastAsia="en-US" w:bidi="ar-SA"/>
-              </w:rPr>
-              <w:t>T</w:t>
-            </w:r>
-            <w:r>
-              <w:rPr>
-                <w:rFonts w:eastAsia="Calibri" w:cs="Times New Roman" w:ascii="Times New Roman" w:hAnsi="Times New Roman"/>
-                <w:b w:val="false"/>
-                <w:bCs w:val="false"/>
-                <w:i w:val="false"/>
-                <w:kern w:val="0"/>
-                <w:sz w:val="22"/>
-                <w:szCs w:val="22"/>
-                <w:lang w:val="en-US" w:eastAsia="en-US" w:bidi="ar-SA"/>
-              </w:rPr>
-              <w:t>he question is whether reasonable grounds existed for the defendant’s belief, judged objectively at the time the prosecution began.</w:t>
+              <w:t>A rental-store manager reported a customer to police for theft after he stopped paying on a rented air compressor. A magistrate found probable cause and issued a warrant for his arrest. In Feb 2016, the parties executed a settlement agreement which released all claims concerning the air compressor. However, in Feb 2018, a police officer arrested Plaintiff on the outstanding warrant from United Rentals. Plaintiff told the officer to call his attorney so the attorney could explain that his dispute with United Rentals had been settled, the officer did not. Howell sued United Rentals and Miller, the manager for false arrest, false imprisonment and other claims. The court of appeals affirmed summary judgment for the store. The question is whether reasonable grounds existed for the defendant’s belief, judged objectively at the time the prosecution began.</w:t>
             </w:r>
           </w:p>
         </w:tc>
@@ -1036,91 +746,7 @@
                 <w:szCs w:val="24"/>
                 <w:lang w:val="en-US" w:eastAsia="en-US" w:bidi="ar-SA"/>
               </w:rPr>
-              <w:t>VendEngine’s</w:t>
-            </w:r>
-            <w:r>
-              <w:rPr>
-                <w:rFonts w:eastAsia="Calibri" w:cs="Times New Roman" w:ascii="Times New Roman" w:hAnsi="Times New Roman"/>
-                <w:b w:val="false"/>
-                <w:i w:val="false"/>
-                <w:kern w:val="0"/>
-                <w:sz w:val="22"/>
-                <w:szCs w:val="24"/>
-                <w:lang w:val="en-US" w:eastAsia="en-US" w:bidi="ar-SA"/>
-              </w:rPr>
-              <w:t xml:space="preserve"> inmate-messaging system identified the plaintiff as the sender of threatening messages, and she was arrested. The court affirmed summary judgment </w:t>
-            </w:r>
-            <w:r>
-              <w:rPr>
-                <w:rFonts w:eastAsia="Calibri" w:cs="Times New Roman" w:ascii="Times New Roman" w:hAnsi="Times New Roman"/>
-                <w:b w:val="false"/>
-                <w:i w:val="false"/>
-                <w:kern w:val="0"/>
-                <w:sz w:val="22"/>
-                <w:szCs w:val="24"/>
-                <w:lang w:val="en-US" w:eastAsia="en-US" w:bidi="ar-SA"/>
-              </w:rPr>
-              <w:t>for VendEngine</w:t>
-            </w:r>
-            <w:r>
-              <w:rPr>
-                <w:rFonts w:eastAsia="Calibri" w:cs="Times New Roman" w:ascii="Times New Roman" w:hAnsi="Times New Roman"/>
-                <w:b w:val="false"/>
-                <w:i w:val="false"/>
-                <w:kern w:val="0"/>
-                <w:sz w:val="22"/>
-                <w:szCs w:val="24"/>
-                <w:lang w:val="en-US" w:eastAsia="en-US" w:bidi="ar-SA"/>
-              </w:rPr>
-              <w:t xml:space="preserve">. Tennessee recognizes no </w:t>
-            </w:r>
-            <w:r>
-              <w:rPr>
-                <w:rFonts w:eastAsia="Calibri" w:cs="Times New Roman" w:ascii="Times New Roman" w:hAnsi="Times New Roman"/>
-                <w:b w:val="false"/>
-                <w:i w:val="false"/>
-                <w:kern w:val="0"/>
-                <w:sz w:val="22"/>
-                <w:szCs w:val="24"/>
-                <w:lang w:val="en-US" w:eastAsia="en-US" w:bidi="ar-SA"/>
-              </w:rPr>
-              <w:t xml:space="preserve">cause of action for </w:t>
-            </w:r>
-            <w:r>
-              <w:rPr>
-                <w:rFonts w:eastAsia="Calibri" w:cs="Times New Roman" w:ascii="Times New Roman" w:hAnsi="Times New Roman"/>
-                <w:b w:val="false"/>
-                <w:i w:val="false"/>
-                <w:kern w:val="0"/>
-                <w:sz w:val="22"/>
-                <w:szCs w:val="24"/>
-                <w:lang w:val="en-US" w:eastAsia="en-US" w:bidi="ar-SA"/>
-              </w:rPr>
-              <w:t xml:space="preserve">negligent-identification, and merely providing mistaken information is not enough </w:t>
-            </w:r>
-            <w:r>
-              <w:rPr>
-                <w:rFonts w:eastAsia="Calibri" w:cs="Times New Roman" w:ascii="Times New Roman" w:hAnsi="Times New Roman"/>
-                <w:b w:val="false"/>
-                <w:i w:val="false"/>
-                <w:kern w:val="0"/>
-                <w:sz w:val="22"/>
-                <w:szCs w:val="24"/>
-                <w:lang w:val="en-US" w:eastAsia="en-US" w:bidi="ar-SA"/>
-              </w:rPr>
-              <w:t xml:space="preserve">to hold the defendant liable </w:t>
-            </w:r>
-            <w:r>
-              <w:rPr>
-                <w:rFonts w:eastAsia="Calibri" w:cs="Times New Roman" w:ascii="Times New Roman" w:hAnsi="Times New Roman"/>
-                <w:b w:val="false"/>
-                <w:i w:val="false"/>
-                <w:kern w:val="0"/>
-                <w:sz w:val="22"/>
-                <w:szCs w:val="24"/>
-                <w:lang w:val="en-US" w:eastAsia="en-US" w:bidi="ar-SA"/>
-              </w:rPr>
-              <w:t>without knowledge that it was false.</w:t>
+              <w:t>VendEngine’s inmate-messaging system identified the plaintiff as the sender of threatening messages, and she was arrested. The court affirmed summary judgment for VendEngine. Tennessee recognizes no cause of action for negligent-identification, and merely providing mistaken information is not enough to hold the defendant liable without knowledge that it was false.</w:t>
             </w:r>
           </w:p>
         </w:tc>
@@ -1154,17 +780,7 @@
                 <w:sz w:val="24"/>
                 <w:szCs w:val="24"/>
               </w:rPr>
-              <w:t>Contrasting</w:t>
-            </w:r>
-            <w:r>
-              <w:rPr>
-                <w:rFonts w:ascii="Times New Roman" w:hAnsi="Times New Roman"/>
-                <w:b w:val="false"/>
-                <w:bCs w:val="false"/>
-                <w:sz w:val="24"/>
-                <w:szCs w:val="24"/>
-              </w:rPr>
-              <w:t xml:space="preserve"> Case</w:t>
+              <w:t>Contrasting Case</w:t>
             </w:r>
           </w:p>
         </w:tc>
@@ -1403,6 +1019,7 @@
               <w:rPr>
                 <w:rFonts w:ascii="Times New Roman" w:hAnsi="Times New Roman"/>
                 <w:b w:val="false"/>
+                <w:b w:val="false"/>
               </w:rPr>
             </w:pPr>
             <w:r>
@@ -1591,20 +1208,7 @@
                 <w:szCs w:val="24"/>
                 <w:lang w:val="en-US" w:eastAsia="en-US" w:bidi="ar-SA"/>
               </w:rPr>
-              <w:t>Summary judgment affirmed where there was no evidence the vendor knew its information was false or acted with malice. “</w:t>
-            </w:r>
-            <w:r>
-              <w:rPr>
-                <w:rFonts w:eastAsia="Calibri" w:cs="Times New Roman" w:ascii="Times New Roman" w:hAnsi="Times New Roman"/>
-                <w:b w:val="false"/>
-                <w:bCs w:val="false"/>
-                <w:i w:val="false"/>
-                <w:kern w:val="0"/>
-                <w:sz w:val="22"/>
-                <w:szCs w:val="24"/>
-                <w:lang w:val="en-US" w:eastAsia="en-US" w:bidi="ar-SA"/>
-              </w:rPr>
-              <w:t>The undisputed facts also show that Ms. Jacobi cannot establish the second element-that VendEngine acted with malice to orchestrate her arrest.” at *7</w:t>
+              <w:t>Summary judgment affirmed where there was no evidence the vendor knew its information was false or acted with malice. “The undisputed facts also show that Ms. Jacobi cannot establish the second element-that VendEngine acted with malice to orchestrate her arrest.” at *7</w:t>
             </w:r>
           </w:p>
         </w:tc>
@@ -1724,137 +1328,7 @@
                 <w:szCs w:val="24"/>
                 <w:lang w:val="en-US" w:eastAsia="en-US" w:bidi="ar-SA"/>
               </w:rPr>
-              <w:t>Bushnell sued Brown claiming that Brown and local governments were rigging the wrecker rotation system in Brown’s favor. Following the dismissal of this suit, Brown filed a complaint against Bushnell for malicious prosecution.</w:t>
-            </w:r>
-            <w:r>
-              <w:rPr>
-                <w:rFonts w:eastAsia="Calibri" w:cs="Times New Roman" w:ascii="Times New Roman" w:hAnsi="Times New Roman"/>
-                <w:b w:val="false"/>
-                <w:bCs w:val="false"/>
-                <w:i w:val="false"/>
-                <w:kern w:val="0"/>
-                <w:sz w:val="22"/>
-                <w:szCs w:val="24"/>
-                <w:lang w:val="en-US" w:eastAsia="en-US" w:bidi="ar-SA"/>
-              </w:rPr>
-              <w:t xml:space="preserve"> </w:t>
-            </w:r>
-            <w:r>
-              <w:rPr>
-                <w:rFonts w:eastAsia="Calibri" w:cs="Times New Roman" w:ascii="Times New Roman" w:hAnsi="Times New Roman"/>
-                <w:b w:val="false"/>
-                <w:bCs w:val="false"/>
-                <w:i w:val="false"/>
-                <w:kern w:val="0"/>
-                <w:sz w:val="22"/>
-                <w:szCs w:val="24"/>
-                <w:lang w:val="en-US" w:eastAsia="en-US" w:bidi="ar-SA"/>
-              </w:rPr>
-              <w:t xml:space="preserve">The trial court in the malicious prosecution case found that </w:t>
-            </w:r>
-            <w:r>
-              <w:rPr>
-                <w:rFonts w:eastAsia="Calibri" w:cs="Times New Roman" w:ascii="Times New Roman" w:hAnsi="Times New Roman"/>
-                <w:b w:val="false"/>
-                <w:bCs w:val="false"/>
-                <w:i w:val="false"/>
-                <w:kern w:val="0"/>
-                <w:sz w:val="22"/>
-                <w:szCs w:val="24"/>
-                <w:lang w:val="en-US" w:eastAsia="en-US" w:bidi="ar-SA"/>
-              </w:rPr>
-              <w:t>“</w:t>
-            </w:r>
-            <w:r>
-              <w:rPr>
-                <w:rFonts w:eastAsia="Calibri" w:cs="Times New Roman" w:ascii="Times New Roman" w:hAnsi="Times New Roman"/>
-                <w:b w:val="false"/>
-                <w:bCs w:val="false"/>
-                <w:i w:val="false"/>
-                <w:kern w:val="0"/>
-                <w:sz w:val="22"/>
-                <w:szCs w:val="24"/>
-                <w:lang w:val="en-US" w:eastAsia="en-US" w:bidi="ar-SA"/>
-              </w:rPr>
-              <w:t>The whole process was launched after only very limited and flawed investigation</w:t>
-            </w:r>
-            <w:r>
-              <w:rPr>
-                <w:rFonts w:eastAsia="Calibri" w:cs="Times New Roman" w:ascii="Times New Roman" w:hAnsi="Times New Roman"/>
-                <w:b w:val="false"/>
-                <w:bCs w:val="false"/>
-                <w:i w:val="false"/>
-                <w:kern w:val="0"/>
-                <w:sz w:val="22"/>
-                <w:szCs w:val="24"/>
-                <w:lang w:val="en-US" w:eastAsia="en-US" w:bidi="ar-SA"/>
-              </w:rPr>
-              <w:t xml:space="preserve">”. </w:t>
-            </w:r>
-            <w:r>
-              <w:rPr>
-                <w:rFonts w:eastAsia="Calibri" w:cs="Times New Roman" w:ascii="Times New Roman" w:hAnsi="Times New Roman"/>
-                <w:b w:val="false"/>
-                <w:bCs w:val="false"/>
-                <w:i w:val="false"/>
-                <w:kern w:val="0"/>
-                <w:sz w:val="22"/>
-                <w:szCs w:val="24"/>
-                <w:lang w:val="en-US" w:eastAsia="en-US" w:bidi="ar-SA"/>
-              </w:rPr>
-              <w:t xml:space="preserve">“The complaint contained and relied on multiple falsehoods.” </w:t>
-            </w:r>
-            <w:r>
-              <w:rPr>
-                <w:rFonts w:eastAsia="Calibri" w:cs="Times New Roman" w:ascii="Times New Roman" w:hAnsi="Times New Roman"/>
-                <w:b w:val="false"/>
-                <w:bCs w:val="false"/>
-                <w:i w:val="false"/>
-                <w:kern w:val="0"/>
-                <w:sz w:val="22"/>
-                <w:szCs w:val="24"/>
-                <w:lang w:val="en-US" w:eastAsia="en-US" w:bidi="ar-SA"/>
-              </w:rPr>
-              <w:t xml:space="preserve">The court affirmed the inference of malice from circumstantial evidence. </w:t>
-            </w:r>
-            <w:r>
-              <w:rPr>
-                <w:rFonts w:eastAsia="Calibri" w:cs="Times New Roman" w:ascii="Times New Roman" w:hAnsi="Times New Roman"/>
-                <w:b w:val="false"/>
-                <w:bCs w:val="false"/>
-                <w:i w:val="false"/>
-                <w:kern w:val="0"/>
-                <w:sz w:val="22"/>
-                <w:szCs w:val="24"/>
-                <w:lang w:val="en-US" w:eastAsia="en-US" w:bidi="ar-SA"/>
-              </w:rPr>
-              <w:t>I</w:t>
-            </w:r>
-            <w:r>
-              <w:rPr>
-                <w:rFonts w:eastAsia="Calibri" w:cs="Times New Roman" w:ascii="Times New Roman" w:hAnsi="Times New Roman"/>
-                <w:b w:val="false"/>
-                <w:bCs w:val="false"/>
-                <w:i w:val="false"/>
-                <w:kern w:val="0"/>
-                <w:sz w:val="22"/>
-                <w:szCs w:val="24"/>
-                <w:lang w:val="en-US" w:eastAsia="en-US" w:bidi="ar-SA"/>
-              </w:rPr>
-              <w:t xml:space="preserve">ll will is unnecessary and any improper motive suffices </w:t>
-            </w:r>
-            <w:r>
-              <w:rPr>
-                <w:rFonts w:eastAsia="Calibri" w:cs="Times New Roman" w:ascii="Times New Roman" w:hAnsi="Times New Roman"/>
-                <w:b w:val="false"/>
-                <w:bCs w:val="false"/>
-                <w:i w:val="false"/>
-                <w:kern w:val="0"/>
-                <w:sz w:val="22"/>
-                <w:szCs w:val="24"/>
-                <w:lang w:val="en-US" w:eastAsia="en-US" w:bidi="ar-SA"/>
-              </w:rPr>
-              <w:t>for malicious prosecution.</w:t>
+              <w:t>Bushnell sued Brown claiming that Brown and local governments were rigging the wrecker rotation system in Brown’s favor. Following the dismissal of this suit, Brown filed a complaint against Bushnell for malicious prosecution. The trial court in the malicious prosecution case found that “The whole process was launched after only very limited and flawed investigation”. “The complaint contained and relied on multiple falsehoods.” The court affirmed the inference of malice from circumstantial evidence. Ill will is unnecessary and any improper motive suffices for malicious prosecution.</w:t>
             </w:r>
           </w:p>
         </w:tc>
@@ -1974,20 +1448,7 @@
                 <w:szCs w:val="24"/>
                 <w:lang w:val="en-US" w:eastAsia="en-US" w:bidi="ar-SA"/>
               </w:rPr>
-              <w:t xml:space="preserve">Thompson owned an old interurban street car. Schulz agreed to construct and addition to it, a room along its side. </w:t>
-            </w:r>
-            <w:r>
-              <w:rPr>
-                <w:rFonts w:eastAsia="Calibri" w:cs="Times New Roman" w:ascii="Times New Roman" w:hAnsi="Times New Roman"/>
-                <w:b w:val="false"/>
-                <w:bCs w:val="false"/>
-                <w:i w:val="false"/>
-                <w:kern w:val="0"/>
-                <w:sz w:val="22"/>
-                <w:szCs w:val="24"/>
-                <w:lang w:val="en-US" w:eastAsia="en-US" w:bidi="ar-SA"/>
-              </w:rPr>
-              <w:t xml:space="preserve">Schulz could not pay his laborers and suppliers, these suppliers and laborers began to notify Thompson of their claims for liens on his property. Thus, Thompson swore out a criminal warrant charging Schulz with a violation of Code 7944a by misappropriating the $520 he paid Schulz under the contract. Thompson had no reasonable ground to believe that Schulz was guilty of the felony charged. The court found that malice need not be ill will but may be any motive other than good faith. A verdict was awarded for the plaintiff. </w:t>
+              <w:t xml:space="preserve">Thompson owned an old interurban street car. Schulz agreed to construct and addition to it, a room along its side. Schulz could not pay his laborers and suppliers, these suppliers and laborers began to notify Thompson of their claims for liens on his property. Thus, Thompson swore out a criminal warrant charging Schulz with a violation of Code 7944a by misappropriating the $520 he paid Schulz under the contract. Thompson had no reasonable ground to believe that Schulz was guilty of the felony charged. The court found that malice need not be ill will but may be any motive other than good faith. A verdict was awarded for the plaintiff. </w:t>
             </w:r>
           </w:p>
         </w:tc>
@@ -2047,6 +1508,1131 @@
           <w:szCs w:val="28"/>
         </w:rPr>
         <w:tab/>
+      </w:r>
+    </w:p>
+    <w:p>
+      <w:pPr>
+        <w:pStyle w:val="Normal"/>
+        <w:spacing w:before="0" w:after="200"/>
+        <w:rPr>
+          <w:b w:val="false"/>
+          <w:b w:val="false"/>
+          <w:bCs w:val="false"/>
+        </w:rPr>
+      </w:pPr>
+      <w:r>
+        <w:rPr>
+          <w:b w:val="false"/>
+          <w:bCs w:val="false"/>
+        </w:rPr>
+        <w:t>Issue I</w:t>
+      </w:r>
+    </w:p>
+    <w:p>
+      <w:pPr>
+        <w:pStyle w:val="Normal"/>
+        <w:numPr>
+          <w:ilvl w:val="0"/>
+          <w:numId w:val="2"/>
+        </w:numPr>
+        <w:spacing w:before="0" w:after="200"/>
+        <w:rPr/>
+      </w:pPr>
+      <w:r>
+        <w:rPr>
+          <w:b w:val="false"/>
+          <w:bCs w:val="false"/>
+        </w:rPr>
+        <w:t>Conclusion</w:t>
+      </w:r>
+    </w:p>
+    <w:p>
+      <w:pPr>
+        <w:pStyle w:val="Normal"/>
+        <w:numPr>
+          <w:ilvl w:val="0"/>
+          <w:numId w:val="2"/>
+        </w:numPr>
+        <w:spacing w:before="0" w:after="200"/>
+        <w:rPr/>
+      </w:pPr>
+      <w:r>
+        <w:rPr>
+          <w:b w:val="false"/>
+          <w:bCs w:val="false"/>
+        </w:rPr>
+        <w:t>R</w:t>
+      </w:r>
+      <w:r>
+        <w:rPr>
+          <w:b w:val="false"/>
+          <w:bCs w:val="false"/>
+        </w:rPr>
+        <w:t>ule</w:t>
+      </w:r>
+    </w:p>
+    <w:p>
+      <w:pPr>
+        <w:pStyle w:val="Normal"/>
+        <w:numPr>
+          <w:ilvl w:val="1"/>
+          <w:numId w:val="2"/>
+        </w:numPr>
+        <w:spacing w:before="0" w:after="200"/>
+        <w:rPr/>
+      </w:pPr>
+      <w:r>
+        <w:rPr>
+          <w:b w:val="false"/>
+          <w:bCs w:val="false"/>
+        </w:rPr>
+        <w:t>28 USC 1332(a)(1): Starting point for the domicile question</w:t>
+      </w:r>
+    </w:p>
+    <w:p>
+      <w:pPr>
+        <w:pStyle w:val="Normal"/>
+        <w:numPr>
+          <w:ilvl w:val="1"/>
+          <w:numId w:val="2"/>
+        </w:numPr>
+        <w:spacing w:before="0" w:after="200"/>
+        <w:rPr/>
+      </w:pPr>
+      <w:r>
+        <w:rPr>
+          <w:b w:val="false"/>
+          <w:bCs w:val="false"/>
+        </w:rPr>
+        <w:t>Robinette: Shows burden of proof and short term facts don’t count</w:t>
+      </w:r>
+    </w:p>
+    <w:p>
+      <w:pPr>
+        <w:pStyle w:val="Normal"/>
+        <w:numPr>
+          <w:ilvl w:val="0"/>
+          <w:numId w:val="2"/>
+        </w:numPr>
+        <w:spacing w:before="0" w:after="200"/>
+        <w:rPr/>
+      </w:pPr>
+      <w:r>
+        <w:rPr>
+          <w:b w:val="false"/>
+          <w:bCs w:val="false"/>
+        </w:rPr>
+        <w:t>Explanation Comparable</w:t>
+      </w:r>
+    </w:p>
+    <w:p>
+      <w:pPr>
+        <w:pStyle w:val="Normal"/>
+        <w:numPr>
+          <w:ilvl w:val="1"/>
+          <w:numId w:val="2"/>
+        </w:numPr>
+        <w:spacing w:before="0" w:after="200"/>
+        <w:rPr/>
+      </w:pPr>
+      <w:r>
+        <w:rPr>
+          <w:b w:val="false"/>
+          <w:bCs w:val="false"/>
+        </w:rPr>
+        <w:t>Pitt</w:t>
+      </w:r>
+    </w:p>
+    <w:p>
+      <w:pPr>
+        <w:pStyle w:val="Normal"/>
+        <w:numPr>
+          <w:ilvl w:val="2"/>
+          <w:numId w:val="2"/>
+        </w:numPr>
+        <w:spacing w:before="0" w:after="200"/>
+        <w:rPr/>
+      </w:pPr>
+      <w:r>
+        <w:rPr>
+          <w:b w:val="false"/>
+          <w:bCs w:val="false"/>
+        </w:rPr>
+        <w:t>Same legal question: Both cases ask whether a person who has long time domicile and takes a second residence in another state has acquired a new domicile therefore</w:t>
+      </w:r>
+    </w:p>
+    <w:p>
+      <w:pPr>
+        <w:pStyle w:val="Normal"/>
+        <w:numPr>
+          <w:ilvl w:val="2"/>
+          <w:numId w:val="2"/>
+        </w:numPr>
+        <w:spacing w:before="0" w:after="200"/>
+        <w:rPr/>
+      </w:pPr>
+      <w:r>
+        <w:rPr>
+          <w:b w:val="false"/>
+          <w:bCs w:val="false"/>
+        </w:rPr>
+        <w:t>Close factual match on three points: splitting nights, voter registration (neither changed it), Pitt used his Kentucky address in a court filing, Fox keeps his mail address in Nashville</w:t>
+      </w:r>
+    </w:p>
+    <w:p>
+      <w:pPr>
+        <w:pStyle w:val="Normal"/>
+        <w:numPr>
+          <w:ilvl w:val="2"/>
+          <w:numId w:val="2"/>
+        </w:numPr>
+        <w:spacing w:before="0" w:after="200"/>
+        <w:rPr/>
+      </w:pPr>
+      <w:r>
+        <w:rPr>
+          <w:b w:val="false"/>
+          <w:bCs w:val="false"/>
+        </w:rPr>
+        <w:t>Same result I predict: The court held that Pitt kept his original domicile despite spending more time in the new state</w:t>
+      </w:r>
+    </w:p>
+    <w:p>
+      <w:pPr>
+        <w:pStyle w:val="Normal"/>
+        <w:numPr>
+          <w:ilvl w:val="2"/>
+          <w:numId w:val="2"/>
+        </w:numPr>
+        <w:spacing w:before="0" w:after="200"/>
+        <w:rPr/>
+      </w:pPr>
+      <w:r>
+        <w:rPr>
+          <w:b w:val="false"/>
+          <w:bCs w:val="false"/>
+        </w:rPr>
+        <w:t xml:space="preserve">Fox’s facts are stronger </w:t>
+      </w:r>
+    </w:p>
+    <w:p>
+      <w:pPr>
+        <w:pStyle w:val="Normal"/>
+        <w:numPr>
+          <w:ilvl w:val="0"/>
+          <w:numId w:val="2"/>
+        </w:numPr>
+        <w:spacing w:before="0" w:after="200"/>
+        <w:rPr/>
+      </w:pPr>
+      <w:r>
+        <w:rPr>
+          <w:b w:val="false"/>
+          <w:bCs w:val="false"/>
+        </w:rPr>
+        <w:t>Analysis Comparable</w:t>
+      </w:r>
+    </w:p>
+    <w:p>
+      <w:pPr>
+        <w:pStyle w:val="Normal"/>
+        <w:numPr>
+          <w:ilvl w:val="1"/>
+          <w:numId w:val="2"/>
+        </w:numPr>
+        <w:spacing w:before="0" w:after="200"/>
+        <w:rPr/>
+      </w:pPr>
+      <w:r>
+        <w:rPr>
+          <w:b w:val="false"/>
+          <w:bCs w:val="false"/>
+        </w:rPr>
+        <w:t>Pitt</w:t>
+      </w:r>
+    </w:p>
+    <w:p>
+      <w:pPr>
+        <w:pStyle w:val="Normal"/>
+        <w:numPr>
+          <w:ilvl w:val="0"/>
+          <w:numId w:val="2"/>
+        </w:numPr>
+        <w:spacing w:before="0" w:after="200"/>
+        <w:rPr/>
+      </w:pPr>
+      <w:r>
+        <w:rPr>
+          <w:b w:val="false"/>
+          <w:bCs w:val="false"/>
+        </w:rPr>
+        <w:t>Explanation</w:t>
+      </w:r>
+      <w:r>
+        <w:rPr>
+          <w:b w:val="false"/>
+          <w:bCs w:val="false"/>
+        </w:rPr>
+        <w:t xml:space="preserve"> Distinguishable</w:t>
+      </w:r>
+    </w:p>
+    <w:p>
+      <w:pPr>
+        <w:pStyle w:val="Normal"/>
+        <w:numPr>
+          <w:ilvl w:val="1"/>
+          <w:numId w:val="2"/>
+        </w:numPr>
+        <w:spacing w:before="0" w:after="200"/>
+        <w:rPr/>
+      </w:pPr>
+      <w:r>
+        <w:rPr>
+          <w:b w:val="false"/>
+          <w:bCs w:val="false"/>
+        </w:rPr>
+        <w:t>Edick</w:t>
+      </w:r>
+    </w:p>
+    <w:p>
+      <w:pPr>
+        <w:pStyle w:val="Normal"/>
+        <w:numPr>
+          <w:ilvl w:val="2"/>
+          <w:numId w:val="2"/>
+        </w:numPr>
+        <w:spacing w:before="0" w:after="200"/>
+        <w:rPr/>
+      </w:pPr>
+      <w:r>
+        <w:rPr>
+          <w:b w:val="false"/>
+          <w:bCs w:val="false"/>
+        </w:rPr>
+        <w:t>Similar setup to Fox (worked four days a week in Chicago, spent the rest of the week in Michigan)</w:t>
+      </w:r>
+    </w:p>
+    <w:p>
+      <w:pPr>
+        <w:pStyle w:val="Normal"/>
+        <w:numPr>
+          <w:ilvl w:val="2"/>
+          <w:numId w:val="2"/>
+        </w:numPr>
+        <w:spacing w:before="0" w:after="200"/>
+        <w:rPr/>
+      </w:pPr>
+      <w:r>
+        <w:rPr>
+          <w:b w:val="false"/>
+          <w:bCs w:val="false"/>
+        </w:rPr>
+        <w:t xml:space="preserve">Opposite result: The court held that she had changed her domicile to the new state </w:t>
+      </w:r>
+    </w:p>
+    <w:p>
+      <w:pPr>
+        <w:pStyle w:val="Normal"/>
+        <w:numPr>
+          <w:ilvl w:val="2"/>
+          <w:numId w:val="2"/>
+        </w:numPr>
+        <w:spacing w:before="0" w:after="200"/>
+        <w:rPr/>
+      </w:pPr>
+      <w:r>
+        <w:rPr>
+          <w:b w:val="false"/>
+          <w:bCs w:val="false"/>
+        </w:rPr>
+        <w:t>The reasons for the opposite result are missing in Fox’s case: a MI driver’s license, car insurance, and car registration, voting in Michigan, claiming Michigan homestead tax exemption, cutting back Chicago work to prepare to retire in Michigan</w:t>
+      </w:r>
+    </w:p>
+    <w:p>
+      <w:pPr>
+        <w:pStyle w:val="Normal"/>
+        <w:numPr>
+          <w:ilvl w:val="2"/>
+          <w:numId w:val="2"/>
+        </w:numPr>
+        <w:spacing w:before="0" w:after="200"/>
+        <w:rPr/>
+      </w:pPr>
+      <w:r>
+        <w:rPr>
+          <w:b w:val="false"/>
+          <w:bCs w:val="false"/>
+        </w:rPr>
+        <w:t>She formed an intent to move and then acted on it</w:t>
+      </w:r>
+    </w:p>
+    <w:p>
+      <w:pPr>
+        <w:pStyle w:val="Normal"/>
+        <w:numPr>
+          <w:ilvl w:val="2"/>
+          <w:numId w:val="2"/>
+        </w:numPr>
+        <w:spacing w:before="0" w:after="200"/>
+        <w:rPr/>
+      </w:pPr>
+      <w:r>
+        <w:rPr>
+          <w:b w:val="false"/>
+          <w:bCs w:val="false"/>
+        </w:rPr>
+        <w:t>Addresses Apeture’s best argument</w:t>
+      </w:r>
+    </w:p>
+    <w:p>
+      <w:pPr>
+        <w:pStyle w:val="Normal"/>
+        <w:numPr>
+          <w:ilvl w:val="0"/>
+          <w:numId w:val="2"/>
+        </w:numPr>
+        <w:spacing w:before="0" w:after="200"/>
+        <w:rPr/>
+      </w:pPr>
+      <w:r>
+        <w:rPr>
+          <w:b w:val="false"/>
+          <w:bCs w:val="false"/>
+        </w:rPr>
+        <w:t>Analysis</w:t>
+      </w:r>
+      <w:r>
+        <w:rPr>
+          <w:b w:val="false"/>
+          <w:bCs w:val="false"/>
+        </w:rPr>
+        <w:t xml:space="preserve"> Distinguishable</w:t>
+      </w:r>
+    </w:p>
+    <w:p>
+      <w:pPr>
+        <w:pStyle w:val="Normal"/>
+        <w:numPr>
+          <w:ilvl w:val="1"/>
+          <w:numId w:val="2"/>
+        </w:numPr>
+        <w:spacing w:before="0" w:after="200"/>
+        <w:rPr/>
+      </w:pPr>
+      <w:r>
+        <w:rPr>
+          <w:b w:val="false"/>
+          <w:bCs w:val="false"/>
+        </w:rPr>
+        <w:t>Edick</w:t>
+      </w:r>
+    </w:p>
+    <w:p>
+      <w:pPr>
+        <w:pStyle w:val="Normal"/>
+        <w:numPr>
+          <w:ilvl w:val="0"/>
+          <w:numId w:val="2"/>
+        </w:numPr>
+        <w:spacing w:before="0" w:after="200"/>
+        <w:rPr/>
+      </w:pPr>
+      <w:r>
+        <w:rPr>
+          <w:b w:val="false"/>
+          <w:bCs w:val="false"/>
+        </w:rPr>
+        <w:t>Conclusion</w:t>
+      </w:r>
+    </w:p>
+    <w:p>
+      <w:pPr>
+        <w:pStyle w:val="Normal"/>
+        <w:spacing w:before="0" w:after="200"/>
+        <w:rPr>
+          <w:b w:val="false"/>
+          <w:b w:val="false"/>
+          <w:bCs w:val="false"/>
+        </w:rPr>
+      </w:pPr>
+      <w:r>
+        <w:rPr/>
+      </w:r>
+    </w:p>
+    <w:p>
+      <w:pPr>
+        <w:pStyle w:val="Normal"/>
+        <w:spacing w:before="0" w:after="200"/>
+        <w:rPr/>
+      </w:pPr>
+      <w:r>
+        <w:rPr>
+          <w:b w:val="false"/>
+          <w:bCs w:val="false"/>
+        </w:rPr>
+        <w:t>Issue II</w:t>
+      </w:r>
+    </w:p>
+    <w:p>
+      <w:pPr>
+        <w:pStyle w:val="Normal"/>
+        <w:numPr>
+          <w:ilvl w:val="0"/>
+          <w:numId w:val="3"/>
+        </w:numPr>
+        <w:spacing w:before="0" w:after="200"/>
+        <w:rPr/>
+      </w:pPr>
+      <w:r>
+        <w:rPr>
+          <w:b w:val="false"/>
+          <w:bCs w:val="false"/>
+        </w:rPr>
+        <w:t>Conclusion</w:t>
+      </w:r>
+    </w:p>
+    <w:p>
+      <w:pPr>
+        <w:pStyle w:val="Normal"/>
+        <w:numPr>
+          <w:ilvl w:val="0"/>
+          <w:numId w:val="3"/>
+        </w:numPr>
+        <w:spacing w:before="0" w:after="200"/>
+        <w:rPr/>
+      </w:pPr>
+      <w:r>
+        <w:rPr>
+          <w:b w:val="false"/>
+          <w:bCs w:val="false"/>
+        </w:rPr>
+        <w:t>Rule</w:t>
+      </w:r>
+    </w:p>
+    <w:p>
+      <w:pPr>
+        <w:pStyle w:val="Normal"/>
+        <w:numPr>
+          <w:ilvl w:val="1"/>
+          <w:numId w:val="3"/>
+        </w:numPr>
+        <w:spacing w:before="0" w:after="200"/>
+        <w:rPr/>
+      </w:pPr>
+      <w:r>
+        <w:rPr>
+          <w:b w:val="false"/>
+          <w:bCs w:val="false"/>
+        </w:rPr>
+        <w:t>Smith v Hartford Mutual</w:t>
+      </w:r>
+    </w:p>
+    <w:p>
+      <w:pPr>
+        <w:pStyle w:val="Normal"/>
+        <w:numPr>
+          <w:ilvl w:val="2"/>
+          <w:numId w:val="3"/>
+        </w:numPr>
+        <w:spacing w:before="0" w:after="200"/>
+        <w:rPr/>
+      </w:pPr>
+      <w:r>
+        <w:rPr>
+          <w:b w:val="false"/>
+          <w:bCs w:val="false"/>
+        </w:rPr>
+        <w:t>Establish</w:t>
+      </w:r>
+      <w:r>
+        <w:rPr>
+          <w:b w:val="false"/>
+          <w:bCs w:val="false"/>
+        </w:rPr>
+        <w:t>es</w:t>
+      </w:r>
+      <w:r>
+        <w:rPr>
+          <w:b w:val="false"/>
+          <w:bCs w:val="false"/>
+        </w:rPr>
+        <w:t>four element Test</w:t>
+      </w:r>
+    </w:p>
+    <w:p>
+      <w:pPr>
+        <w:pStyle w:val="Normal"/>
+        <w:numPr>
+          <w:ilvl w:val="1"/>
+          <w:numId w:val="3"/>
+        </w:numPr>
+        <w:spacing w:before="0" w:after="200"/>
+        <w:rPr/>
+      </w:pPr>
+      <w:r>
+        <w:rPr>
+          <w:b w:val="false"/>
+          <w:bCs w:val="false"/>
+        </w:rPr>
+        <w:t>Roberts v. Fed Express</w:t>
+      </w:r>
+    </w:p>
+    <w:p>
+      <w:pPr>
+        <w:pStyle w:val="Normal"/>
+        <w:numPr>
+          <w:ilvl w:val="2"/>
+          <w:numId w:val="3"/>
+        </w:numPr>
+        <w:spacing w:before="0" w:after="200"/>
+        <w:rPr/>
+      </w:pPr>
+      <w:r>
+        <w:rPr>
+          <w:b w:val="false"/>
+          <w:bCs w:val="false"/>
+        </w:rPr>
+        <w:t>Gives the rule binding authority since it is a Tennessee Supreme Court decision</w:t>
+      </w:r>
+    </w:p>
+    <w:p>
+      <w:pPr>
+        <w:pStyle w:val="Normal"/>
+        <w:numPr>
+          <w:ilvl w:val="1"/>
+          <w:numId w:val="3"/>
+        </w:numPr>
+        <w:spacing w:before="0" w:after="200"/>
+        <w:rPr/>
+      </w:pPr>
+      <w:r>
+        <w:rPr>
+          <w:b w:val="false"/>
+          <w:bCs w:val="false"/>
+        </w:rPr>
+        <w:t>Dismiss elements 1-4</w:t>
+      </w:r>
+    </w:p>
+    <w:p>
+      <w:pPr>
+        <w:pStyle w:val="Normal"/>
+        <w:numPr>
+          <w:ilvl w:val="1"/>
+          <w:numId w:val="3"/>
+        </w:numPr>
+        <w:spacing w:before="0" w:after="200"/>
+        <w:rPr/>
+      </w:pPr>
+      <w:r>
+        <w:rPr>
+          <w:b w:val="false"/>
+          <w:bCs w:val="false"/>
+        </w:rPr>
+        <w:t>Want of Probable Cause</w:t>
+      </w:r>
+    </w:p>
+    <w:p>
+      <w:pPr>
+        <w:pStyle w:val="Normal"/>
+        <w:numPr>
+          <w:ilvl w:val="2"/>
+          <w:numId w:val="3"/>
+        </w:numPr>
+        <w:spacing w:before="0" w:after="200"/>
+        <w:rPr/>
+      </w:pPr>
+      <w:r>
+        <w:rPr>
+          <w:b w:val="false"/>
+          <w:bCs w:val="false"/>
+        </w:rPr>
+        <w:t>Roberts v. Fed Express</w:t>
+      </w:r>
+    </w:p>
+    <w:p>
+      <w:pPr>
+        <w:pStyle w:val="Normal"/>
+        <w:numPr>
+          <w:ilvl w:val="3"/>
+          <w:numId w:val="3"/>
+        </w:numPr>
+        <w:spacing w:before="0" w:after="200"/>
+        <w:rPr/>
+      </w:pPr>
+      <w:r>
+        <w:rPr>
+          <w:b w:val="false"/>
+          <w:bCs w:val="false"/>
+        </w:rPr>
+        <w:t xml:space="preserve">Establishes Tennessee Supreme Court’s definition of probable cause </w:t>
+      </w:r>
+    </w:p>
+    <w:p>
+      <w:pPr>
+        <w:pStyle w:val="Normal"/>
+        <w:numPr>
+          <w:ilvl w:val="2"/>
+          <w:numId w:val="3"/>
+        </w:numPr>
+        <w:spacing w:before="0" w:after="200"/>
+        <w:rPr/>
+      </w:pPr>
+      <w:r>
+        <w:rPr>
+          <w:b w:val="false"/>
+          <w:bCs w:val="false"/>
+        </w:rPr>
+        <w:t>Howell v. United Rentals</w:t>
+      </w:r>
+    </w:p>
+    <w:p>
+      <w:pPr>
+        <w:pStyle w:val="Normal"/>
+        <w:numPr>
+          <w:ilvl w:val="3"/>
+          <w:numId w:val="3"/>
+        </w:numPr>
+        <w:spacing w:before="0" w:after="200"/>
+        <w:rPr/>
+      </w:pPr>
+      <w:r>
+        <w:rPr>
+          <w:b w:val="false"/>
+          <w:bCs w:val="false"/>
+        </w:rPr>
+        <w:t xml:space="preserve">It establishes that the plaintiff carries a heavy burden on probable cause </w:t>
+      </w:r>
+    </w:p>
+    <w:p>
+      <w:pPr>
+        <w:pStyle w:val="Normal"/>
+        <w:numPr>
+          <w:ilvl w:val="3"/>
+          <w:numId w:val="3"/>
+        </w:numPr>
+        <w:spacing w:before="0" w:after="200"/>
+        <w:rPr/>
+      </w:pPr>
+      <w:r>
+        <w:rPr>
+          <w:b w:val="false"/>
+          <w:bCs w:val="false"/>
+        </w:rPr>
+        <w:t xml:space="preserve">Holds that the question is whether the defendant had reasonable grounds when the prosecution started not whether the plaintiff was actually guilty. So Fox’s innocence alone does not win </w:t>
+      </w:r>
+    </w:p>
+    <w:p>
+      <w:pPr>
+        <w:pStyle w:val="Normal"/>
+        <w:numPr>
+          <w:ilvl w:val="1"/>
+          <w:numId w:val="3"/>
+        </w:numPr>
+        <w:spacing w:before="0" w:after="200"/>
+        <w:rPr/>
+      </w:pPr>
+      <w:r>
+        <w:rPr>
+          <w:b w:val="false"/>
+          <w:bCs w:val="false"/>
+        </w:rPr>
+        <w:t>Malice</w:t>
+      </w:r>
+    </w:p>
+    <w:p>
+      <w:pPr>
+        <w:pStyle w:val="Normal"/>
+        <w:numPr>
+          <w:ilvl w:val="2"/>
+          <w:numId w:val="3"/>
+        </w:numPr>
+        <w:spacing w:before="0" w:after="200"/>
+        <w:rPr/>
+      </w:pPr>
+      <w:r>
+        <w:rPr>
+          <w:b w:val="false"/>
+          <w:bCs w:val="false"/>
+        </w:rPr>
+        <w:t>Brown v. Bushnell</w:t>
+      </w:r>
+    </w:p>
+    <w:p>
+      <w:pPr>
+        <w:pStyle w:val="Normal"/>
+        <w:numPr>
+          <w:ilvl w:val="3"/>
+          <w:numId w:val="3"/>
+        </w:numPr>
+        <w:spacing w:before="0" w:after="200"/>
+        <w:rPr/>
+      </w:pPr>
+      <w:r>
+        <w:rPr>
+          <w:b w:val="false"/>
+          <w:bCs w:val="false"/>
+        </w:rPr>
+        <w:t>Malice can be inferred from absence of probable cause</w:t>
+      </w:r>
+    </w:p>
+    <w:p>
+      <w:pPr>
+        <w:pStyle w:val="Normal"/>
+        <w:numPr>
+          <w:ilvl w:val="3"/>
+          <w:numId w:val="3"/>
+        </w:numPr>
+        <w:spacing w:before="0" w:after="200"/>
+        <w:rPr/>
+      </w:pPr>
+      <w:r>
+        <w:rPr>
+          <w:b w:val="false"/>
+          <w:bCs w:val="false"/>
+        </w:rPr>
+        <w:t>Ill will or personal hatred neet not be shown</w:t>
+      </w:r>
+    </w:p>
+    <w:p>
+      <w:pPr>
+        <w:pStyle w:val="Normal"/>
+        <w:numPr>
+          <w:ilvl w:val="3"/>
+          <w:numId w:val="3"/>
+        </w:numPr>
+        <w:spacing w:before="0" w:after="200"/>
+        <w:rPr/>
+      </w:pPr>
+      <w:r>
+        <w:rPr>
+          <w:b w:val="false"/>
+          <w:bCs w:val="false"/>
+        </w:rPr>
+        <w:t>Any improper motive is sufficient</w:t>
+      </w:r>
+    </w:p>
+    <w:p>
+      <w:pPr>
+        <w:pStyle w:val="Normal"/>
+        <w:numPr>
+          <w:ilvl w:val="2"/>
+          <w:numId w:val="3"/>
+        </w:numPr>
+        <w:spacing w:before="0" w:after="200"/>
+        <w:rPr/>
+      </w:pPr>
+      <w:r>
+        <w:rPr>
+          <w:b w:val="false"/>
+          <w:bCs w:val="false"/>
+        </w:rPr>
+        <w:t>Thompson v. Schulz</w:t>
+      </w:r>
+    </w:p>
+    <w:p>
+      <w:pPr>
+        <w:pStyle w:val="Normal"/>
+        <w:numPr>
+          <w:ilvl w:val="3"/>
+          <w:numId w:val="3"/>
+        </w:numPr>
+        <w:spacing w:before="0" w:after="200"/>
+        <w:rPr/>
+      </w:pPr>
+      <w:r>
+        <w:rPr>
+          <w:b w:val="false"/>
+          <w:bCs w:val="false"/>
+        </w:rPr>
+        <w:t>Malice can be inferred from a motive to get some other act the prosecutor wishes done</w:t>
+      </w:r>
+    </w:p>
+    <w:p>
+      <w:pPr>
+        <w:pStyle w:val="Normal"/>
+        <w:numPr>
+          <w:ilvl w:val="3"/>
+          <w:numId w:val="3"/>
+        </w:numPr>
+        <w:spacing w:before="0" w:after="200"/>
+        <w:rPr/>
+      </w:pPr>
+      <w:r>
+        <w:rPr>
+          <w:b w:val="false"/>
+          <w:bCs w:val="false"/>
+        </w:rPr>
+        <w:t>Analogy to Aperture: Lets me argue that Apeture’s motives were improper</w:t>
+      </w:r>
+    </w:p>
+    <w:p>
+      <w:pPr>
+        <w:pStyle w:val="Normal"/>
+        <w:numPr>
+          <w:ilvl w:val="3"/>
+          <w:numId w:val="3"/>
+        </w:numPr>
+        <w:spacing w:before="0" w:after="200"/>
+        <w:rPr/>
+      </w:pPr>
+      <w:r>
+        <w:rPr>
+          <w:b w:val="false"/>
+          <w:bCs w:val="false"/>
+        </w:rPr>
+        <w:t>It is the only case that ties the motive evidence to the law</w:t>
+      </w:r>
+    </w:p>
+    <w:p>
+      <w:pPr>
+        <w:pStyle w:val="Normal"/>
+        <w:numPr>
+          <w:ilvl w:val="0"/>
+          <w:numId w:val="3"/>
+        </w:numPr>
+        <w:spacing w:before="0" w:after="200"/>
+        <w:rPr/>
+      </w:pPr>
+      <w:r>
+        <w:rPr>
+          <w:b w:val="false"/>
+          <w:bCs w:val="false"/>
+        </w:rPr>
+        <w:t xml:space="preserve">Explanation Comparable </w:t>
+      </w:r>
+    </w:p>
+    <w:p>
+      <w:pPr>
+        <w:pStyle w:val="Normal"/>
+        <w:numPr>
+          <w:ilvl w:val="1"/>
+          <w:numId w:val="3"/>
+        </w:numPr>
+        <w:spacing w:before="0" w:after="200"/>
+        <w:rPr/>
+      </w:pPr>
+      <w:r>
+        <w:rPr>
+          <w:b w:val="false"/>
+          <w:bCs w:val="false"/>
+        </w:rPr>
+        <w:t>Swindle v. Krystal</w:t>
+      </w:r>
+    </w:p>
+    <w:p>
+      <w:pPr>
+        <w:pStyle w:val="Normal"/>
+        <w:numPr>
+          <w:ilvl w:val="2"/>
+          <w:numId w:val="3"/>
+        </w:numPr>
+        <w:spacing w:before="0" w:after="200"/>
+        <w:rPr/>
+      </w:pPr>
+      <w:r>
+        <w:rPr>
+          <w:b w:val="false"/>
+          <w:bCs w:val="false"/>
+        </w:rPr>
+        <w:t xml:space="preserve">Same kind of defendant and conduct. A private business, Krystal, gave police an accusation that led to its employee’s arrest, and the charges were later dismissed. </w:t>
+      </w:r>
+    </w:p>
+    <w:p>
+      <w:pPr>
+        <w:pStyle w:val="Normal"/>
+        <w:numPr>
+          <w:ilvl w:val="2"/>
+          <w:numId w:val="3"/>
+        </w:numPr>
+        <w:spacing w:before="0" w:after="200"/>
+        <w:rPr/>
+      </w:pPr>
+      <w:r>
+        <w:rPr>
+          <w:b w:val="false"/>
+          <w:bCs w:val="false"/>
+        </w:rPr>
+        <w:t xml:space="preserve">Same weakness, one source and no real investigation: Krystal relied on a single coworker. Aperture relied on a single source, its own algorithm. </w:t>
+      </w:r>
+    </w:p>
+    <w:p>
+      <w:pPr>
+        <w:pStyle w:val="Normal"/>
+        <w:numPr>
+          <w:ilvl w:val="2"/>
+          <w:numId w:val="3"/>
+        </w:numPr>
+        <w:spacing w:before="0" w:after="200"/>
+        <w:rPr/>
+      </w:pPr>
+      <w:r>
+        <w:rPr>
+          <w:b w:val="false"/>
+          <w:bCs w:val="false"/>
+        </w:rPr>
+        <w:t>The outcome favors the plaintiff: The court of appeals reversed summary judgment for Krystal and sent probable cause to the jury, this supports my conclusion that a court would let a jury decide probable cause for Fox</w:t>
+      </w:r>
+    </w:p>
+    <w:p>
+      <w:pPr>
+        <w:pStyle w:val="Normal"/>
+        <w:numPr>
+          <w:ilvl w:val="2"/>
+          <w:numId w:val="3"/>
+        </w:numPr>
+        <w:spacing w:before="0" w:after="200"/>
+        <w:rPr/>
+      </w:pPr>
+      <w:r>
+        <w:rPr>
+          <w:b w:val="false"/>
+          <w:bCs w:val="false"/>
+        </w:rPr>
+        <w:t>Fox’s facts are stronger. Krystal had an eyewitness who claimed he saw the theft, Aperture had a moderate match on the system labeled Not an Identification</w:t>
+      </w:r>
+    </w:p>
+    <w:p>
+      <w:pPr>
+        <w:pStyle w:val="Normal"/>
+        <w:numPr>
+          <w:ilvl w:val="0"/>
+          <w:numId w:val="3"/>
+        </w:numPr>
+        <w:spacing w:before="0" w:after="200"/>
+        <w:rPr/>
+      </w:pPr>
+      <w:r>
+        <w:rPr>
+          <w:b w:val="false"/>
+          <w:bCs w:val="false"/>
+        </w:rPr>
+        <w:t>Analysis Comparable</w:t>
+      </w:r>
+    </w:p>
+    <w:p>
+      <w:pPr>
+        <w:pStyle w:val="Normal"/>
+        <w:numPr>
+          <w:ilvl w:val="0"/>
+          <w:numId w:val="3"/>
+        </w:numPr>
+        <w:spacing w:before="0" w:after="200"/>
+        <w:rPr/>
+      </w:pPr>
+      <w:r>
+        <w:rPr>
+          <w:b w:val="false"/>
+          <w:bCs w:val="false"/>
+        </w:rPr>
+        <w:t>Explanation Distinguishable</w:t>
+      </w:r>
+    </w:p>
+    <w:p>
+      <w:pPr>
+        <w:pStyle w:val="Normal"/>
+        <w:numPr>
+          <w:ilvl w:val="1"/>
+          <w:numId w:val="3"/>
+        </w:numPr>
+        <w:spacing w:before="0" w:after="200"/>
+        <w:rPr/>
+      </w:pPr>
+      <w:r>
+        <w:rPr>
+          <w:b w:val="false"/>
+          <w:bCs w:val="false"/>
+        </w:rPr>
+        <w:t xml:space="preserve">Jacobi v. VendEngine </w:t>
+      </w:r>
+    </w:p>
+    <w:p>
+      <w:pPr>
+        <w:pStyle w:val="Normal"/>
+        <w:numPr>
+          <w:ilvl w:val="2"/>
+          <w:numId w:val="3"/>
+        </w:numPr>
+        <w:spacing w:before="0" w:after="200"/>
+        <w:rPr/>
+      </w:pPr>
+      <w:r>
+        <w:rPr>
+          <w:b w:val="false"/>
+          <w:bCs w:val="false"/>
+        </w:rPr>
+        <w:t>Similar facts. A technology company’s automated system misidentified the plaintiff, that information went to the authorities, and she was arrested</w:t>
+      </w:r>
+    </w:p>
+    <w:p>
+      <w:pPr>
+        <w:pStyle w:val="Normal"/>
+        <w:numPr>
+          <w:ilvl w:val="2"/>
+          <w:numId w:val="3"/>
+        </w:numPr>
+        <w:spacing w:before="0" w:after="200"/>
+        <w:rPr/>
+      </w:pPr>
+      <w:r>
+        <w:rPr>
+          <w:b w:val="false"/>
+          <w:bCs w:val="false"/>
+        </w:rPr>
+        <w:t xml:space="preserve">Opposite Result. The court affirmed summary judgment for VendEngine. Aperture will cite it to argue that a company isn’t liable just because it technology got it wrong. </w:t>
+      </w:r>
+    </w:p>
+    <w:p>
+      <w:pPr>
+        <w:pStyle w:val="Normal"/>
+        <w:numPr>
+          <w:ilvl w:val="2"/>
+          <w:numId w:val="3"/>
+        </w:numPr>
+        <w:spacing w:before="0" w:after="200"/>
+        <w:rPr/>
+      </w:pPr>
+      <w:r>
+        <w:rPr>
+          <w:b w:val="false"/>
+          <w:bCs w:val="false"/>
+        </w:rPr>
+        <w:t>It sets the standard Aperture has to fail: No negligent identification claim, known falsity, no malice</w:t>
+      </w:r>
+    </w:p>
+    <w:p>
+      <w:pPr>
+        <w:pStyle w:val="Normal"/>
+        <w:numPr>
+          <w:ilvl w:val="2"/>
+          <w:numId w:val="3"/>
+        </w:numPr>
+        <w:spacing w:before="0" w:after="200"/>
+        <w:rPr/>
+      </w:pPr>
+      <w:r>
+        <w:rPr>
+          <w:b w:val="false"/>
+          <w:bCs w:val="false"/>
+        </w:rPr>
+        <w:t>The reasons why VendEngine won are that knowing falsity and malice were not presented</w:t>
+      </w:r>
+    </w:p>
+    <w:p>
+      <w:pPr>
+        <w:pStyle w:val="Normal"/>
+        <w:numPr>
+          <w:ilvl w:val="0"/>
+          <w:numId w:val="3"/>
+        </w:numPr>
+        <w:spacing w:before="0" w:after="200"/>
+        <w:rPr/>
+      </w:pPr>
+      <w:r>
+        <w:rPr>
+          <w:b w:val="false"/>
+          <w:bCs w:val="false"/>
+        </w:rPr>
+        <w:t>Analysis Distinguishable</w:t>
       </w:r>
     </w:p>
     <w:sectPr>
@@ -2323,6 +2909,143 @@
   <w:abstractNum w:abstractNumId="3">
     <w:lvl w:ilvl="0">
       <w:start w:val="1"/>
+      <w:numFmt w:val="bullet"/>
+      <w:lvlText w:val=""/>
+      <w:lvlJc w:val="left"/>
+      <w:pPr>
+        <w:tabs>
+          <w:tab w:val="num" w:pos="720"/>
+        </w:tabs>
+        <w:ind w:left="720" w:hanging="360"/>
+      </w:pPr>
+      <w:rPr>
+        <w:rFonts w:ascii="Symbol" w:hAnsi="Symbol" w:cs="Symbol" w:hint="default"/>
+      </w:rPr>
+    </w:lvl>
+    <w:lvl w:ilvl="1">
+      <w:start w:val="1"/>
+      <w:numFmt w:val="bullet"/>
+      <w:lvlText w:val="◦"/>
+      <w:lvlJc w:val="left"/>
+      <w:pPr>
+        <w:tabs>
+          <w:tab w:val="num" w:pos="1080"/>
+        </w:tabs>
+        <w:ind w:left="1080" w:hanging="360"/>
+      </w:pPr>
+      <w:rPr>
+        <w:rFonts w:ascii="OpenSymbol" w:hAnsi="OpenSymbol" w:cs="OpenSymbol" w:hint="default"/>
+      </w:rPr>
+    </w:lvl>
+    <w:lvl w:ilvl="2">
+      <w:start w:val="1"/>
+      <w:numFmt w:val="bullet"/>
+      <w:lvlText w:val="▪"/>
+      <w:lvlJc w:val="left"/>
+      <w:pPr>
+        <w:tabs>
+          <w:tab w:val="num" w:pos="1440"/>
+        </w:tabs>
+        <w:ind w:left="1440" w:hanging="360"/>
+      </w:pPr>
+      <w:rPr>
+        <w:rFonts w:ascii="OpenSymbol" w:hAnsi="OpenSymbol" w:cs="OpenSymbol" w:hint="default"/>
+      </w:rPr>
+    </w:lvl>
+    <w:lvl w:ilvl="3">
+      <w:start w:val="1"/>
+      <w:numFmt w:val="bullet"/>
+      <w:lvlText w:val=""/>
+      <w:lvlJc w:val="left"/>
+      <w:pPr>
+        <w:tabs>
+          <w:tab w:val="num" w:pos="1800"/>
+        </w:tabs>
+        <w:ind w:left="1800" w:hanging="360"/>
+      </w:pPr>
+      <w:rPr>
+        <w:rFonts w:ascii="Symbol" w:hAnsi="Symbol" w:cs="Symbol" w:hint="default"/>
+      </w:rPr>
+    </w:lvl>
+    <w:lvl w:ilvl="4">
+      <w:start w:val="1"/>
+      <w:numFmt w:val="bullet"/>
+      <w:lvlText w:val="◦"/>
+      <w:lvlJc w:val="left"/>
+      <w:pPr>
+        <w:tabs>
+          <w:tab w:val="num" w:pos="2160"/>
+        </w:tabs>
+        <w:ind w:left="2160" w:hanging="360"/>
+      </w:pPr>
+      <w:rPr>
+        <w:rFonts w:ascii="OpenSymbol" w:hAnsi="OpenSymbol" w:cs="OpenSymbol" w:hint="default"/>
+      </w:rPr>
+    </w:lvl>
+    <w:lvl w:ilvl="5">
+      <w:start w:val="1"/>
+      <w:numFmt w:val="bullet"/>
+      <w:lvlText w:val="▪"/>
+      <w:lvlJc w:val="left"/>
+      <w:pPr>
+        <w:tabs>
+          <w:tab w:val="num" w:pos="2520"/>
+        </w:tabs>
+        <w:ind w:left="2520" w:hanging="360"/>
+      </w:pPr>
+      <w:rPr>
+        <w:rFonts w:ascii="OpenSymbol" w:hAnsi="OpenSymbol" w:cs="OpenSymbol" w:hint="default"/>
+      </w:rPr>
+    </w:lvl>
+    <w:lvl w:ilvl="6">
+      <w:start w:val="1"/>
+      <w:numFmt w:val="bullet"/>
+      <w:lvlText w:val=""/>
+      <w:lvlJc w:val="left"/>
+      <w:pPr>
+        <w:tabs>
+          <w:tab w:val="num" w:pos="2880"/>
+        </w:tabs>
+        <w:ind w:left="2880" w:hanging="360"/>
+      </w:pPr>
+      <w:rPr>
+        <w:rFonts w:ascii="Symbol" w:hAnsi="Symbol" w:cs="Symbol" w:hint="default"/>
+      </w:rPr>
+    </w:lvl>
+    <w:lvl w:ilvl="7">
+      <w:start w:val="1"/>
+      <w:numFmt w:val="bullet"/>
+      <w:lvlText w:val="◦"/>
+      <w:lvlJc w:val="left"/>
+      <w:pPr>
+        <w:tabs>
+          <w:tab w:val="num" w:pos="3240"/>
+        </w:tabs>
+        <w:ind w:left="3240" w:hanging="360"/>
+      </w:pPr>
+      <w:rPr>
+        <w:rFonts w:ascii="OpenSymbol" w:hAnsi="OpenSymbol" w:cs="OpenSymbol" w:hint="default"/>
+      </w:rPr>
+    </w:lvl>
+    <w:lvl w:ilvl="8">
+      <w:start w:val="1"/>
+      <w:numFmt w:val="bullet"/>
+      <w:lvlText w:val="▪"/>
+      <w:lvlJc w:val="left"/>
+      <w:pPr>
+        <w:tabs>
+          <w:tab w:val="num" w:pos="3600"/>
+        </w:tabs>
+        <w:ind w:left="3600" w:hanging="360"/>
+      </w:pPr>
+      <w:rPr>
+        <w:rFonts w:ascii="OpenSymbol" w:hAnsi="OpenSymbol" w:cs="OpenSymbol" w:hint="default"/>
+      </w:rPr>
+    </w:lvl>
+  </w:abstractNum>
+  <w:abstractNum w:abstractNumId="4">
+    <w:lvl w:ilvl="0">
+      <w:start w:val="1"/>
       <w:numFmt w:val="none"/>
       <w:suff w:val="nothing"/>
       <w:lvlText w:val=""/>
@@ -2447,6 +3170,9 @@
   </w:num>
   <w:num w:numId="3">
     <w:abstractNumId w:val="3"/>
+  </w:num>
+  <w:num w:numId="4">
+    <w:abstractNumId w:val="4"/>
   </w:num>
 </w:numbering>
 </file>

</xml_diff>